<commit_message>
docs: verify GoEmotions application, threshold and hyperparameter claims
</commit_message>
<xml_diff>
--- a/reports/BAI_BAO_GOEMOTIONS_IEEE.docx
+++ b/reports/BAI_BAO_GOEMOTIONS_IEEE.docx
@@ -514,6 +514,14 @@
     </w:p>
     <w:p>
       <w:r>
+        <w:t>C1 tham khảo thông số BERT trong mục 5.3 của GoEmotions [1]; C2/C3 dùng cấu hình nhóm lựa chọn triển khai. Chín run chính có một cấu hình learning rate/số epoch cho mỗi kiến trúc và ba seed. Nhóm chưa thực hiện tìm kiếm siêu tham số có hệ thống; chọn checkpoint theo validation giữa các epoch không chứng minh đã tối ưu learning rate. Chưa có thí nghiệm để quy lựa chọn của C2 cho gradient explosion hoặc kết luận C3 hội tụ nhanh hơn. So sánh này xét các hệ thống có cấu hình đã khai báo; nghiên cứu riêng tác độ</w:t>
+      </w:r>
+      <w:r>
+        <w:t>ng kiến trúc cần kiểm soát thêm siêu tham số và ngân sách huấn luyện.</w:t>
+      </w:r>
+    </w:p>
+    <w:p>
+      <w:r>
         <w:t>Trong từng seed, chọn checkpoint có Macro-F1 validation @0,5 cao nhất, hòa chọn epoch sớm hơn. Kiến trúc dùng cho D được chọn theo mean Macro-F1 validation @0,5 của đủ ba seed ở cả ba C. Checkpoint đại diện của kiến trúc được chọn tiếp bằng validation theo luật đã lưu; không lấy seed có test cao nhất. Ngưỡng, revision model, hash và đường dẫn run được khóa trong hồ sơ. Đầu ra demo phải thuộc đúng checkpoint/mapping/ngưỡng đã chọn.</w:t>
       </w:r>
     </w:p>
@@ -532,10 +540,7 @@
     </w:p>
     <w:p>
       <w:r>
-        <w:t xml:space="preserve">Cùng validation được dùng chọn ngưỡng rồi tính bảng tuned-validation nên điểm này có thể lạc quan. Kết luận tổng quát cần bảng test sau khi ngưỡng đã cố định. Không chỉnh </w:t>
-      </w:r>
-      <w:r>
-        <w:t>ngưỡng tiếp để làm test đẹp hơn. Khi không có nhãn vượt ngưỡng, demo thông báo chưa có nhãn đủ điểm; có thể hiển thị top scores để người dùng hiểu, nhưng top scores không tự biến thành nhãn được dự đoán. Không thêm fallback neutral/argmax vào một hệ thống rồi so sánh với hệ thống khác không có fallback.</w:t>
+        <w:t>Cùng validation được dùng chọn ngưỡng rồi tính bảng tuned-validation nên điểm này có thể lạc quan. Kết luận tổng quát cần bảng test sau khi ngưỡng đã cố định. Không chỉnh ngưỡng tiếp để làm test đẹp hơn. Khi không có nhãn vượt ngưỡng, demo thông báo chưa có nhãn đủ điểm; có thể hiển thị top scores để người dùng hiểu, nhưng top scores không tự biến thành nhãn được dự đoán. Không thêm fallback neutral/argmax vào một hệ thống rồi so sánh với hệ thống khác không có fallback.</w:t>
       </w:r>
     </w:p>
     <w:p>
@@ -758,10 +763,10 @@
     </w:tbl>
     <w:p>
       <w:r>
-        <w:t xml:space="preserve">Với K = 3 seed, báo trung bình m = Σsᵢ/K và sample standard deviation theo (7), </w:t>
+        <w:t xml:space="preserve">Với K = 3 seed, </w:t>
       </w:r>
       <w:r>
-        <w:t>ddof=1 [17]. Đây là độ biến động giữa các lần huấn luyện, không phải độ biến động giữa 28 nhãn, không phải confidence interval và không tự cho một kiểm định ý nghĩa thống kê. A/B một run không nhận std=0 để giả vờ ổn định như C.</w:t>
+        <w:t>báo trung bình m = Σsᵢ/K và sample standard deviation theo (7), ddof=1 [17]. Đây là độ biến động giữa các lần huấn luyện, không phải độ biến động giữa 28 nhãn, không phải confidence interval và không tự cho một kiểm định ý nghĩa thống kê. A/B một run không nhận std=0 để giả vờ ổn định như C.</w:t>
       </w:r>
     </w:p>
     <w:tbl>
@@ -845,6 +850,7 @@
         <w:pStyle w:val="Heading2"/>
       </w:pPr>
       <w:r>
+        <w:lastRenderedPageBreak/>
         <w:t>B. Bảng thực nghiệm theo trạng thái thực tế</w:t>
       </w:r>
     </w:p>
@@ -853,7 +859,7 @@
         <w:rPr>
           <w:b/>
         </w:rPr>
-        <w:t>Trạng thái 09/10/2026 07:03 (UTC+7): Đủ hồ sơ benchmark theo summary.</w:t>
+        <w:t>Trạng thái 10/10/2026 15:19 (UTC+7): Đủ hồ sơ benchmark theo summary.</w:t>
       </w:r>
       <w:r>
         <w:t xml:space="preserve"> Có 72/72 hàng kết quả và 36/36 nhóm tổng hợp theo thiết kế; C full 9/9, B full đã có. Số hàng phụ thuộc artifact đã hoàn thành, không tính smoke. Dấu — là thiếu/chưa đủ ba seed hoặc không áp dụng, không phải F1=0. A-S là A standard; A-W là A balanced; C1/C2/C3 là BERT/RoBERTa/DistilBERT. Val là validation, N=5.426; Test N=5.427.</w:t>
@@ -871,7 +877,6 @@
           <w:b/>
           <w:sz w:val="16"/>
         </w:rPr>
-        <w:lastRenderedPageBreak/>
         <w:t>BẢNG I. SO SÁNH HỆ THỐNG GỐC, NGƯỠNG 0,5.</w:t>
       </w:r>
     </w:p>
@@ -1625,13 +1630,7 @@
               <w:rPr>
                 <w:sz w:val="16"/>
               </w:rPr>
-              <w:t xml:space="preserve">0.5820 ± </w:t>
-            </w:r>
-            <w:r>
-              <w:rPr>
-                <w:sz w:val="16"/>
-              </w:rPr>
-              <w:t>0.0040</w:t>
+              <w:t>0.5820 ± 0.0040</w:t>
             </w:r>
           </w:p>
         </w:tc>
@@ -1963,10 +1962,10 @@
     </w:tbl>
     <w:p>
       <w:r>
-        <w:t xml:space="preserve">Cần đủ ba seed để có hàng C mean±std. Một C đã hoàn tất vẫn xuất hiện trong bảng từng </w:t>
+        <w:t xml:space="preserve">Cần đủ ba seed để có </w:t>
       </w:r>
       <w:r>
-        <w:t>seed ở dưới; không điền điểm đó vào hàng trung bình ba seed.</w:t>
+        <w:t>hàng C mean±std. Một C đã hoàn tất vẫn xuất hiện trong bảng từng seed ở dưới; không điền điểm đó vào hàng trung bình ba seed.</w:t>
       </w:r>
     </w:p>
     <w:p>
@@ -3066,10 +3065,10 @@
     </w:tbl>
     <w:p>
       <w:r>
-        <w:t xml:space="preserve">fixed: ngưỡng 0,5; global: một ngưỡng chọn trên val; tuned: riêng từng nhãn chọn trên val. </w:t>
+        <w:t xml:space="preserve">fixed: ngưỡng 0,5; </w:t>
       </w:r>
       <w:r>
-        <w:t>Các số là full validation, nhưng global/tuned không phải ước lượng độc lập với bước calibration.</w:t>
+        <w:t>global: một ngưỡng chọn trên val; tuned: riêng từng nhãn chọn trên val. Các số là full validation, nhưng global/tuned không phải ước lượng độc lập với bước calibration.</w:t>
       </w:r>
     </w:p>
     <w:p>
@@ -3963,7 +3962,13 @@
               <w:rPr>
                 <w:sz w:val="16"/>
               </w:rPr>
-              <w:t>0.4872 ± 0.0156</w:t>
+              <w:t xml:space="preserve">0.4872 ± </w:t>
+            </w:r>
+            <w:r>
+              <w:rPr>
+                <w:sz w:val="16"/>
+              </w:rPr>
+              <w:t>0.0156</w:t>
             </w:r>
           </w:p>
         </w:tc>
@@ -5039,13 +5044,7 @@
               <w:rPr>
                 <w:sz w:val="16"/>
               </w:rPr>
-              <w:t xml:space="preserve">0.5674 ± </w:t>
-            </w:r>
-            <w:r>
-              <w:rPr>
-                <w:sz w:val="16"/>
-              </w:rPr>
-              <w:t>0.0032</w:t>
+              <w:t>0.5674 ± 0.0032</w:t>
             </w:r>
           </w:p>
         </w:tc>
@@ -5275,7 +5274,10 @@
     </w:tbl>
     <w:p>
       <w:r>
-        <w:t>Split được ghi theo từng hàng. Không xếp hạng một hàng val với một hàng test như cùng phép đo.</w:t>
+        <w:t xml:space="preserve">Split được ghi theo từng hàng. Không xếp hạng một hàng val </w:t>
+      </w:r>
+      <w:r>
+        <w:t>với một hàng test như cùng phép đo.</w:t>
       </w:r>
     </w:p>
     <w:p>
@@ -5290,14 +5292,7 @@
           <w:b/>
           <w:sz w:val="16"/>
         </w:rPr>
-        <w:t xml:space="preserve">BẢNG V. TỪNG SEED C; </w:t>
-      </w:r>
-      <w:r>
-        <w:rPr>
-          <w:b/>
-          <w:sz w:val="16"/>
-        </w:rPr>
-        <w:t>MACRO-F1.</w:t>
+        <w:t>BẢNG V. TỪNG SEED C; MACRO-F1.</w:t>
       </w:r>
     </w:p>
     <w:tbl>
@@ -6832,10 +6827,10 @@
     </w:tbl>
     <w:p>
       <w:r>
-        <w:t xml:space="preserve">Epoch chọn bằng validation @0,5 của chính seed. Bảy metrics từng seed/split/ngưỡng nằm trong reports/project_results/all_runs.csv; mean_std.csv giữ toàn bộ nhóm, </w:t>
+        <w:t xml:space="preserve">Epoch chọn bằng validation @0,5 của chính seed. Bảy metrics từng seed/split/ngưỡng nằm trong </w:t>
       </w:r>
       <w:r>
-        <w:t>không chỉ bảng rút gọn.</w:t>
+        <w:t>reports/project_results/all_runs.csv; mean_std.csv giữ toàn bộ nhóm, không chỉ bảng rút gọn.</w:t>
       </w:r>
     </w:p>
     <w:p>
@@ -7715,7 +7710,13 @@
               <w:rPr>
                 <w:sz w:val="16"/>
               </w:rPr>
-              <w:t>0.0000 ± 0.0000</w:t>
+              <w:t xml:space="preserve">0.0000 ± </w:t>
+            </w:r>
+            <w:r>
+              <w:rPr>
+                <w:sz w:val="16"/>
+              </w:rPr>
+              <w:t>0.0000</w:t>
             </w:r>
           </w:p>
         </w:tc>
@@ -8663,6 +8664,7 @@
               <w:rPr>
                 <w:sz w:val="16"/>
               </w:rPr>
+              <w:lastRenderedPageBreak/>
               <w:t>relief</w:t>
             </w:r>
           </w:p>
@@ -8783,13 +8785,7 @@
               <w:rPr>
                 <w:sz w:val="16"/>
               </w:rPr>
-              <w:t xml:space="preserve">0.2356 ± </w:t>
-            </w:r>
-            <w:r>
-              <w:rPr>
-                <w:sz w:val="16"/>
-              </w:rPr>
-              <w:t>0.1042</w:t>
+              <w:t>0.2356 ± 0.1042</w:t>
             </w:r>
           </w:p>
         </w:tc>
@@ -9365,7 +9361,6 @@
               <w:rPr>
                 <w:sz w:val="16"/>
               </w:rPr>
-              <w:lastRenderedPageBreak/>
               <w:t>nervousness</w:t>
             </w:r>
           </w:p>
@@ -10562,10 +10557,10 @@
     </w:tbl>
     <w:p>
       <w:r>
-        <w:t xml:space="preserve">Train+/Eval+ là support dương trong train/split đánh giá. A: standard fixed→balanced tuned, một run; C: fixed→tuned cùng </w:t>
+        <w:t xml:space="preserve">Train+/Eval+ là support dương trong train/split đánh giá. </w:t>
       </w:r>
       <w:r>
-        <w:t>checkpoint/seed, đủ ba seed mới có mean±std. Δ là trung bình chênh lệch cặp seed; mọi tăng/giảm và std của Δ được giữ trong rare_before_after.csv. Ô — là thiếu/chưa đủ dữ liệu.</w:t>
+        <w:t>A: standard fixed→balanced tuned, một run; C: fixed→tuned cùng checkpoint/seed, đủ ba seed mới có mean±std. Δ là trung bình chênh lệch cặp seed; mọi tăng/giảm và std của Δ được giữ trong rare_before_after.csv. Ô — là thiếu/chưa đủ dữ liệu.</w:t>
       </w:r>
     </w:p>
     <w:p>
@@ -10765,7 +10760,14 @@
                 <w:b/>
                 <w:sz w:val="16"/>
               </w:rPr>
-              <w:t>Đủ điều kiện</w:t>
+              <w:t xml:space="preserve">Đủ </w:t>
+            </w:r>
+            <w:r>
+              <w:rPr>
+                <w:b/>
+                <w:sz w:val="16"/>
+              </w:rPr>
+              <w:t>điều kiện</w:t>
             </w:r>
           </w:p>
         </w:tc>
@@ -11019,13 +11021,7 @@
               <w:rPr>
                 <w:sz w:val="16"/>
               </w:rPr>
-              <w:t xml:space="preserve">Bỏ </w:t>
-            </w:r>
-            <w:r>
-              <w:rPr>
-                <w:sz w:val="16"/>
-              </w:rPr>
-              <w:t>nhãn hiếm</w:t>
+              <w:t>Bỏ nhãn hiếm</w:t>
             </w:r>
           </w:p>
         </w:tc>
@@ -12235,7 +12231,10 @@
     </w:p>
     <w:p>
       <w:r>
-        <w:t>Nhận xét đã ghi sau đọc câu/nhãn/scores: Các từ 'shy', 'awkward' và tình huống đưa danh thiếp là dấu hiệu ngôn ngữ về sự ngượng ngùng. C1 nhận ra embarrassment; C2/C3 có score nhãn này dưới 0.5 nên bỏ sót. Embarrassment có 303 mẫu train và thuộc nhóm năm nhãn hiếm đã xác định từ train. Không suy diễn cơ chế attention, nguyên nhân do độ dài hoặc tác dụng của weighting từ riêng một ví dụ.</w:t>
+        <w:t xml:space="preserve">Nhận xét đã ghi sau đọc câu/nhãn/scores: Các từ </w:t>
+      </w:r>
+      <w:r>
+        <w:t>'shy', 'awkward' và tình huống đưa danh thiếp là dấu hiệu ngôn ngữ về sự ngượng ngùng. C1 nhận ra embarrassment; C2/C3 có score nhãn này dưới 0.5 nên bỏ sót. Embarrassment có 303 mẫu train và thuộc nhóm năm nhãn hiếm đã xác định từ train. Không suy diễn cơ chế attention, nguyên nhân do độ dài hoặc tác dụng của weighting từ riêng một ví dụ.</w:t>
       </w:r>
     </w:p>
     <w:p>
@@ -12243,6 +12242,7 @@
         <w:rPr>
           <w:b/>
         </w:rPr>
+        <w:lastRenderedPageBreak/>
         <w:t>missed_extra_pair, ID eczcvgx.</w:t>
       </w:r>
       <w:r>
@@ -12256,7 +12256,6 @@
     </w:p>
     <w:p>
       <w:r>
-        <w:lastRenderedPageBreak/>
         <w:t>C2 seed 2026: dự đoán neutral; bỏ sót không; nhãn thừa không; gặp nhóm lỗi đang xét: False. Scores liên quan: neutral=0.6429.</w:t>
       </w:r>
     </w:p>
@@ -12321,15 +12320,15 @@
     </w:p>
     <w:p>
       <w:r>
-        <w:t>Demo C được chọn theo hồ sơ: bert, seed 123; rule kiến trúc: highest validation mean Macro-F1@0.5; tie: lower sample std, fewer parameters, name; rule checkpoint: best validation Macro-F1 seed in winning architecture; smaller seed on tie; ngưỡng mặc định: 0.5. Nguồn selected_model.json; không chọn lại bằng test.</w:t>
+        <w:t xml:space="preserve">Demo C được chọn theo hồ sơ: bert, seed 123; rule kiến trúc: highest validation mean Macro-F1@0.5; tie: lower sample std, fewer parameters, name; rule checkpoint: best </w:t>
+      </w:r>
+      <w:r>
+        <w:t>validation Macro-F1 seed in winning architecture; smaller seed on tie; ngưỡng mặc định: 0.5. Nguồn selected_model.json; không chọn lại bằng test.</w:t>
       </w:r>
     </w:p>
     <w:p>
       <w:r>
-        <w:t xml:space="preserve">Đã có hồ sơ kiểm suy luận demo (reports/demo_verification.json). Trạng thái ghi nhận: PASS; </w:t>
-      </w:r>
-      <w:r>
-        <w:t>đây là kiểm tại thời điểm hồ sơ, không tự khẳng định server hiện đang mở.</w:t>
+        <w:t>Đã có hồ sơ kiểm suy luận demo (reports/demo_verification.json). Trạng thái ghi nhận: PASS; đây là kiểm tại thời điểm hồ sơ, không tự khẳng định server hiện đang mở.</w:t>
       </w:r>
     </w:p>
     <w:p>
@@ -12344,6 +12343,21 @@
     </w:p>
     <w:p>
       <w:r>
+        <w:t>Phân biệt mức chứng cứ: validation tuned F1 đo trên chính validation đã quét ngưỡng; test locked F1 đo trên test với checkpoint và ngưỡng đã khóa. Điểm tuned-validation có thể lạc quan, không dùng thay điểm test hoặc so trực tiếp với test của paper. Việc đánh giá test không cho phép điều chỉnh lại ngưỡng để chọn hàng đẹp hơn.</w:t>
+      </w:r>
+    </w:p>
+    <w:p>
+      <w:r>
+        <w:t>Ở C1 BERT trên test, mean Micro-Recall tăng từ 0.5322 lên 0.6437, mean Micro-Precision giảm từ 0.6421 xuống 0.5446, mean Hamming Loss tăng từ 0.0318 lên 0.0373 khi chuyển ngưỡng 0,5 sang ngưỡng riêng. Đây là đánh đổi quan sát trên toàn bộ 28 nhãn, không quy toàn bộ thay đổi cho riêng năm nhãn hiếm.</w:t>
+      </w:r>
+    </w:p>
+    <w:p>
+      <w:r>
+        <w:t>Chiều thay đổi không áp dụng cho mọi hệ thống: A balanced trên test sau tuning có Micro-Precision 0.4561, cao hơn fixed 0.4043, và Hamming Loss 0.0467, thấp hơn fixed 0.0547. Vì vậy không viết rằng tuning luôn tăng Recall hoặc luôn làm Precision/Hamming xấu đi. Báo từng cấu hình và từng nhãn bằng TP/FP/FN, support và P/R/F1; không kết luận cả năm nhãn hiếm đều cải thiện.</w:t>
+      </w:r>
+    </w:p>
+    <w:p>
+      <w:r>
         <w:t>Đối chiếu riêng threshold ở A balanced trên test: 4/5 nhãn hiếm giảm F1 khi chuyển fixed→tuned; grief 0.4286→0.4615 (+0.0330); pride 0.4615→0.4167 (-0.0449); relief 0.1333→0.1176 (-0.0157); nervousness 0.2979→0.1714 (-0.1264); embarrassment 0.3333→0.2778 (-0.0556). Bảng standard fixed→balanced tuned là thay đổi kết hợp weighting/ngưỡng, khác ablation này. Ngưỡng tốt trên validation có thể không giữ lợi thế trên test; không quy mọi mức tăng của bảng kết hợp cho threshold.</w:t>
       </w:r>
     </w:p>
@@ -12354,10 +12368,11 @@
     </w:p>
     <w:p>
       <w:r>
-        <w:t>Audit B ghi trung bình 15.3818 nhãn dự đoán/câu ở ngưỡng 0,5, so với 1.1662 nhãn thật/câu trên test. Lượt audit đã kiểm code, cấu hình/head MNLI ba lớp, remap nhãn, scores/checksum và metrics đã lưu; chưa phát hiện lỗi triển khai cụ thể trong phạm vi đó. Lượt này không chạy inference mới, không đối chiếu raw logits và không kiểm lại toàn byte trọng số. NLI-neutral khác candidate neutral của GoEmotions; score hai lớp entailment/contradiction không mặc nhiên là xác suất cảm xúc đã được hiệu chuẩn. Hồ sơ: ZERO</w:t>
+        <w:t xml:space="preserve">Audit B ghi trung bình 15.3818 nhãn dự đoán/câu ở ngưỡng 0,5, so với 1.1662 nhãn thật/câu trên test. Lượt audit đã kiểm code, cấu hình/head MNLI ba lớp, remap nhãn, scores/checksum và metrics đã lưu; chưa phát hiện lỗi triển khai cụ thể trong phạm vi đó. Lượt này không chạy inference </w:t>
       </w:r>
       <w:r>
-        <w:t>_SHOT_DIAGNOSTICS.md và execution/zero_shot_audit.json; chưa chứng minh nguyên nhân của mọi FP.</w:t>
+        <w:lastRenderedPageBreak/>
+        <w:t>mới, không đối chiếu raw logits và không kiểm lại toàn byte trọng số. NLI-neutral khác candidate neutral của GoEmotions; score hai lớp entailment/contradiction không mặc nhiên là xác suất cảm xúc đã được hiệu chuẩn. Hồ sơ: ZERO_SHOT_DIAGNOSTICS.md và execution/zero_shot_audit.json; chưa chứng minh nguyên nhân của mọi FP.</w:t>
       </w:r>
     </w:p>
     <w:p>
@@ -12372,11 +12387,7 @@
     </w:p>
     <w:p>
       <w:r>
-        <w:t xml:space="preserve">Demo sử dụng Gradio để nhập câu tiếng Anh, hiển thị nhãn vượt ngưỡng, điểm số và các trạng thái dự đoán [19]. Giao diện không giả lập kết quả của một model chưa có checkpoint. Hồ sơ selected_model.json, mapping nhãn, threshold và hash checkpoint phải khớp. Kiểm demo gồm câu thường, câu đa cảm xúc, dữ liệu rỗng và tình huống không nhãn vượt ngưỡng. </w:t>
-      </w:r>
-      <w:r>
-        <w:lastRenderedPageBreak/>
-        <w:t>Smoke hoặc ảnh chụp một lần không bảo đảm máy khác vẫn chạy; cần hướng dẫn môi trường, kiểm import/khởi động và thời điểm ghi nhận bằng chứng.</w:t>
+        <w:t>Demo sử dụng Gradio để nhập câu tiếng Anh, hiển thị nhãn vượt ngưỡng, điểm số và các trạng thái dự đoán [19]. Giao diện không giả lập kết quả của một model chưa có checkpoint. Hồ sơ selected_model.json, mapping nhãn, threshold và hash checkpoint phải khớp. Kiểm demo gồm câu thường, câu đa cảm xúc, dữ liệu rỗng và tình huống không nhãn vượt ngưỡng. Smoke hoặc ảnh chụp một lần không bảo đảm máy khác vẫn chạy; cần hướng dẫn môi trường, kiểm import/khởi động và thời điểm ghi nhận bằng chứng.</w:t>
       </w:r>
     </w:p>
     <w:p>
@@ -12394,7 +12405,10 @@
     </w:p>
     <w:p>
       <w:r>
-        <w:t>Case Study 4, mục 4.2.3.1, trang in 82–88 trong sách Industrial AI của Jay Lee mô tả tối ưu năng lượng tại nhà máy LCD ở Shenzhen. Hệ thống truyền thống dựa vào FMCS/SCADA, ngưỡng báo động, quan sát và kinh nghiệm vận hành. Hướng Industrial AI kết hợp mô hình cơ chế, dự báo nhu cầu, tối ưu vận hành và theo dõi sức khỏe máy nén khí/chiller [20]. Case này dùng dữ liệu thiết bị và năng lượng, không sử dụng GoEmotions hoặc phân loại cảm xúc NLP.</w:t>
+        <w:t xml:space="preserve">Case Study 4, mục 4.2.3.1, trang in 82–88 trong sách Industrial AI của Jay Lee mô tả tối ưu năng lượng tại nhà máy LCD ở </w:t>
+      </w:r>
+      <w:r>
+        <w:t>Shenzhen. Hệ thống truyền thống dựa vào FMCS/SCADA, ngưỡng báo động, quan sát và kinh nghiệm vận hành. Hướng Industrial AI kết hợp mô hình cơ chế, dự báo nhu cầu, tối ưu vận hành và theo dõi sức khỏe máy nén khí/chiller [20]. Case này dùng dữ liệu thiết bị và năng lượng, không sử dụng GoEmotions hoặc phân loại cảm xúc NLP.</w:t>
       </w:r>
     </w:p>
     <w:p>
@@ -12414,6 +12428,19 @@
       </w:r>
     </w:p>
     <w:p>
+      <w:r>
+        <w:t>Ba hướng ứng dụng được đề xuất: (1) hỗ trợ định tuyến/ưu tiên khách hàng bằng cảm xúc kết hợp loại yêu cầu và luật nghiệp vụ, đo tỷ lệ chuyển đúng/sai, thời gian phản hồi và giải quyết; (2) theo dõi tín hiệu khủng hoảng thương hiệu bằng tổng hợp cảm xúc theo thương hiệu/thời gian, đo cảnh báo đúng/sai, bỏ sót và độ trễ phát hiện; (3) giảm công rà soát bình luận bằng gợi ý nhãn để người đọc xác minh, đo thời gian và chất lượng trước/sau. Nếu dùng MTTR, cần định nghĩa mean time to resolution và mốc đo. Một nh</w:t>
+      </w:r>
+      <w:r>
+        <w:t>ãn anger không tự xác nhận khủng hoảng hoặc xác định bộ phận xử lý.</w:t>
+      </w:r>
+    </w:p>
+    <w:p>
+      <w:r>
+        <w:t>Đây là hướng phát triển chưa được cài hoặc đo tại doanh nghiệp. ROI cần dữ liệu giá trị phần công việc giảm được, chi phí model/tích hợp/vận hành và công sửa dự đoán sai trong cùng kỳ; đồ án không công bố tỷ lệ ROI hoặc số tiền tiết kiệm NLP. Cần thử nghiệm các tập công việc tương đương với tiêu chí chất lượng nhất quán trước khi kết luận tác động nghiệp vụ.</w:t>
+      </w:r>
+    </w:p>
+    <w:p>
       <w:pPr>
         <w:pStyle w:val="Heading2"/>
       </w:pPr>
@@ -12423,21 +12450,15 @@
     </w:p>
     <w:p>
       <w:r>
-        <w:t xml:space="preserve">Reddit tiếng Anh khác phản hồi dịch vụ, văn bản chuyên ngành và tiếng Việt. Taxonomy của </w:t>
-      </w:r>
-      <w:r>
-        <w:t>GoEmotions có thể chưa trùng nhu cầu doanh nghiệp. Trước triển khai cần chọn domain, tạo dữ liệu gán nhãn tại domain đó, kiểm quy trình gán nhãn, đo model và calibration, xác định khi nào chuyển sang người đọc. Dịch câu tiếng Việt sang tiếng Anh trước suy luận là một hệ thống khác, có thêm lỗi dịch và cần đánh giá riêng; không mặc định mô hình hiện có hiểu tiếng Việt.</w:t>
+        <w:t>Reddit tiếng Anh khác phản hồi dịch vụ, văn bản chuyên ngành và tiếng Việt. Taxonomy của GoEmotions có thể chưa trùng nhu cầu doanh nghiệp. Trước triển khai cần chọn domain, tạo dữ liệu gán nhãn tại domain đó, kiểm quy trình gán nhãn, đo model và calibration, xác định khi nào chuyển sang người đọc. Dịch câu tiếng Việt sang tiếng Anh trước suy luận là một hệ thống khác, có thêm lỗi dịch và cần đánh giá riêng; không mặc định mô hình hiện có hiểu tiếng Việt.</w:t>
       </w:r>
     </w:p>
     <w:p>
       <w:r>
-        <w:t xml:space="preserve">Nhãn hiếm có ít ví dụ nên thay đổi vài TP/FP/FN có thể làm F1 biến động nhiều. Annotation cảm xúc còn chịu ảnh hưởng diễn giải chủ quan, </w:t>
+        <w:t>Nhãn hiếm có ít ví dụ nên thay đổi vài TP/FP/FN có thể làm F1 biến động nhiều. Annotation cảm xúc còn chịu ảnh hưởng diễn giải chủ quan, câu ngắn thiếu ngữ cảnh, slang và nội dung mỉa mai. Official split có exact text overlap đã nêu; cần giữ giới hạn này bên cạnh kết quả. Max_length 128 có thể cắt văn bản dài, nhưng số bị cắt cần đo bằng đúng tokenizer của từng C, không gán thống kê tokenizer uncased cũ cho BERT cased. Ba seed hỗ trợ mô tả ổn định bước đầu; chưa đủ để kết luận ưu thế có ý nghĩa thống kê tro</w:t>
       </w:r>
       <w:r>
-        <w:t xml:space="preserve">câu ngắn thiếu ngữ cảnh, slang và nội dung mỉa mai. Official split có exact text overlap đã nêu; cần giữ giới hạn này bên cạnh kết quả. Max_length 128 có thể cắt văn bản dài, nhưng số bị cắt cần đo bằng đúng tokenizer của </w:t>
-      </w:r>
-      <w:r>
-        <w:t>từng C, không gán thống kê tokenizer uncased cũ cho BERT cased. Ba seed hỗ trợ mô tả ổn định bước đầu; chưa đủ để kết luận ưu thế có ý nghĩa thống kê trong mọi môi trường.</w:t>
+        <w:t>ng mọi môi trường.</w:t>
       </w:r>
     </w:p>
     <w:p>
@@ -12455,13 +12476,17 @@
     </w:p>
     <w:p>
       <w:r>
-        <w:t xml:space="preserve">Đồ án giữ bài toán 28 nhãn và official split của GoEmotions, xây A dễ giải thích, B không fine-tune và ba C fine-tune, cùng module đánh giá/threshold. Class weighting và ngưỡng riêng được đối chiếu bằng ablation, support nhãn hiếm và các ví dụ lỗi. Đã có A/B/C full cùng bảng validation/test; C gồm đủ ba seed mỗi kiến trúc. Test sử dụng mô hình/ngưỡng đã khóa trên validation. C1 BERT được chọn theo mean Macro-F1 validation @0,5 (0.4713 ± 0.0066). Trên test @0,5, kiến trúc này đạt Macro-F1 0.4720 ± 0.0045 và </w:t>
+        <w:t xml:space="preserve">Đồ án giữ bài toán 28 nhãn và official split của GoEmotions, xây A dễ giải thích, B không fine-tune và ba C fine-tune, cùng module đánh giá/threshold. Class weighting và </w:t>
       </w:r>
       <w:r>
-        <w:t>Micro-F1 0.5820 ± 0.0040 (mean ± sample std của ba seed, ddof=1). Với ngưỡng riêng khóa trên validation, test Macro-F1 0.5038 ± 0.0097, Micro-F1 0.5900 ± 0.0029; Δ mean so với @0,5 lần lượt +0.0318 và +0.0080. Demo dùng một checkpoint seed 123 của C1 BERT; các điểm trên tổng hợp ba seed của kiến trúc, không phải điểm riêng checkpoint demo. Demo và hồ sơ đối chiếu vẫn cần nhóm kiểm khi chuyển máy. Giá trị đầu ra là cung cấp điểm và nhãn hỗ trợ đọc/phân tích phản hồi. Hiệu quả tại domain doanh nghiệp, tiếng V</w:t>
+        <w:lastRenderedPageBreak/>
+        <w:t>ngưỡng riêng được đối chiếu bằng ablation, support nhãn hiếm và các ví dụ lỗi. Đã có A/B/C full cùng bảng validation/test; C gồm đủ ba seed mỗi kiến trúc. Test sử dụng mô hình/ngưỡng đã khóa trên validation. C1 BERT được chọn theo mean Macro-F1 validation @0,5 (0.4713 ± 0.0066). Trên test @0,5, kiến trúc này đạt Macro-F1 0.4720 ± 0.0045 và Micro-F1 0.5820 ± 0.0040 (mean ± sample std của ba seed, ddof=1). Với ngưỡng riêng khóa trên validation, test Macro-F1 0.5038 ± 0.0097, Micro-F1 0.5900 ± 0.0029; Δ mean s</w:t>
       </w:r>
       <w:r>
-        <w:t>iệt và ROI cần dữ liệu cùng quy trình đo riêng. Liên hệ Case Study 4 giúp giải thích mối quan hệ dữ liệu→quyết định→giá trị, không biến ví dụ tiết kiệm năng lượng thành bằng chứng tài chính của NLP.</w:t>
+        <w:t>o với @0,5 lần lượt +0.0318 và +0.0080. Demo dùng một checkpoint seed 123 của C1 BERT; các điểm trên tổng hợp ba seed của kiến trúc, không phải điểm riêng checkpoint demo. Demo và hồ sơ đối chiếu vẫn cần nhóm kiểm khi chuyển máy. Giá trị đầu ra là cung cấp điểm và nhãn hỗ trợ đọc/phân tích phản hồi. Hiệu quả tại domain doanh nghiệp, tiếng Việt và ROI cần dữ liệu cùng quy trình đo riêng. Liên hệ Case Study 4 giúp giải thích mối quan hệ dữ liệu→quyết định→giá trị, không biến ví dụ tiết kiệm năng lượng thành b</w:t>
+      </w:r>
+      <w:r>
+        <w:t>ằng chứng tài chính của NLP.</w:t>
       </w:r>
     </w:p>
     <w:p>
@@ -12522,7 +12547,6 @@
         <w:rPr>
           <w:sz w:val="16"/>
         </w:rPr>
-        <w:lastRenderedPageBreak/>
         <w:t xml:space="preserve">[2] Google Research, “GoEmotions: README and official data,” Google Research GitHub repository. Accessed: Oct. 8, 2026. [Online]. Available: </w:t>
       </w:r>
       <w:hyperlink r:id="rId7">
@@ -12729,14 +12753,7 @@
             <w:color w:val="154B73"/>
             <w:sz w:val="16"/>
           </w:rPr>
-          <w:t>https://scikit-</w:t>
-        </w:r>
-        <w:r>
-          <w:rPr>
-            <w:color w:val="154B73"/>
-            <w:sz w:val="16"/>
-          </w:rPr>
-          <w:t>learn.org/1.7/modules/generated/sklearn.linear_model.LogisticRegression.html</w:t>
+          <w:t>https://scikit-learn.org/1.7/modules/generated/sklearn.linear_model.LogisticRegression.html</w:t>
         </w:r>
       </w:hyperlink>
     </w:p>
@@ -13134,31 +13151,31 @@
       </w:rPr>
     </w:lvl>
   </w:abstractNum>
-  <w:num w:numId="1" w16cid:durableId="1069691722">
+  <w:num w:numId="1" w16cid:durableId="2024285661">
     <w:abstractNumId w:val="8"/>
   </w:num>
-  <w:num w:numId="2" w16cid:durableId="2113667847">
+  <w:num w:numId="2" w16cid:durableId="1934970849">
     <w:abstractNumId w:val="6"/>
   </w:num>
-  <w:num w:numId="3" w16cid:durableId="713577285">
+  <w:num w:numId="3" w16cid:durableId="1285309905">
     <w:abstractNumId w:val="5"/>
   </w:num>
-  <w:num w:numId="4" w16cid:durableId="141044190">
+  <w:num w:numId="4" w16cid:durableId="1262643378">
     <w:abstractNumId w:val="4"/>
   </w:num>
-  <w:num w:numId="5" w16cid:durableId="257719234">
+  <w:num w:numId="5" w16cid:durableId="973288450">
     <w:abstractNumId w:val="7"/>
   </w:num>
-  <w:num w:numId="6" w16cid:durableId="1300266180">
+  <w:num w:numId="6" w16cid:durableId="162673692">
     <w:abstractNumId w:val="3"/>
   </w:num>
-  <w:num w:numId="7" w16cid:durableId="130177650">
+  <w:num w:numId="7" w16cid:durableId="536964479">
     <w:abstractNumId w:val="2"/>
   </w:num>
-  <w:num w:numId="8" w16cid:durableId="1886257378">
+  <w:num w:numId="8" w16cid:durableId="493839659">
     <w:abstractNumId w:val="1"/>
   </w:num>
-  <w:num w:numId="9" w16cid:durableId="1656452830">
+  <w:num w:numId="9" w16cid:durableId="662197072">
     <w:abstractNumId w:val="0"/>
   </w:num>
 </w:numbering>

</xml_diff>